<commit_message>
Extend SEO review with content strategy and paid media chapters
Adds chapter 8 (content strategy: funnel model, pillar clusters per
vertical, formats, localization, owned audience) and chapter 9 (paid
media: channel mix, campaign architecture, measurement, budget split,
90-day plan and sequencing relative to the SEO cleanup).

https://claude.ai/code/session_017wjFqor33S6v1CmkyVyu3e
</commit_message>
<xml_diff>
--- a/docs/seo-review-peo-sites.docx
+++ b/docs/seo-review-peo-sites.docx
@@ -1982,6 +1982,2326 @@
           <w:color w:val="0F2E4C"/>
           <w:sz w:val="30"/>
         </w:rPr>
+        <w:t>8. Content-strategie</w:t>
+      </w:r>
+    </w:p>
+    <w:p>
+      <w:pPr>
+        <w:spacing w:after="120"/>
+      </w:pPr>
+      <w:r>
+        <w:rPr>
+          <w:color w:val="1F1F1F"/>
+          <w:sz w:val="22"/>
+        </w:rPr>
+        <w:t>Aanvullend advies bij de SEO-review. Bewust strategisch en niet exhaustief — verfijn met data uit GA4/HubSpot/LinkedIn.</w:t>
+      </w:r>
+    </w:p>
+    <w:p>
+      <w:pPr>
+        <w:spacing w:before="200" w:after="80"/>
+      </w:pPr>
+      <w:r>
+        <w:rPr>
+          <w:b/>
+          <w:color w:val="0F2E4C"/>
+          <w:sz w:val="24"/>
+        </w:rPr>
+        <w:t>8.1 Eén funnel-model, drie verschillende invullingen</w:t>
+      </w:r>
+    </w:p>
+    <w:p>
+      <w:pPr>
+        <w:spacing w:after="120"/>
+      </w:pPr>
+      <w:r>
+        <w:rPr>
+          <w:color w:val="1F1F1F"/>
+          <w:sz w:val="22"/>
+        </w:rPr>
+        <w:t>De drie vertical-sites hebben drie compleet verschillende buyer journeys, dus content moet je ook splitsen — niet alleen tone of voice.</w:t>
+      </w:r>
+    </w:p>
+    <w:tbl>
+      <w:tblPr>
+        <w:tblStyle w:val="LightGrid-Accent1"/>
+        <w:tblW w:type="auto" w:w="0"/>
+        <w:tblLayout w:type="autofit"/>
+        <w:tblLook w:firstColumn="1" w:firstRow="1" w:lastColumn="0" w:lastRow="0" w:noHBand="0" w:noVBand="1" w:val="04A0"/>
+      </w:tblPr>
+      <w:tblGrid>
+        <w:gridCol w:w="2436"/>
+        <w:gridCol w:w="2436"/>
+        <w:gridCol w:w="2436"/>
+        <w:gridCol w:w="2436"/>
+      </w:tblGrid>
+      <w:tr>
+        <w:tc>
+          <w:tcPr>
+            <w:tcW w:type="dxa" w:w="1701"/>
+            <w:shd w:val="clear" w:color="auto" w:fill="0F2E4C"/>
+          </w:tcPr>
+          <w:p>
+            <w:pPr>
+              <w:spacing w:after="0"/>
+            </w:pPr>
+            <w:r/>
+            <w:r>
+              <w:rPr>
+                <w:b/>
+                <w:color w:val="FFFFFF"/>
+                <w:sz w:val="20"/>
+              </w:rPr>
+              <w:t>Funnel-fase</w:t>
+            </w:r>
+          </w:p>
+        </w:tc>
+        <w:tc>
+          <w:tcPr>
+            <w:tcW w:type="dxa" w:w="2608"/>
+            <w:shd w:val="clear" w:color="auto" w:fill="0F2E4C"/>
+          </w:tcPr>
+          <w:p>
+            <w:pPr>
+              <w:spacing w:after="0"/>
+            </w:pPr>
+            <w:r/>
+            <w:r>
+              <w:rPr>
+                <w:b/>
+                <w:color w:val="FFFFFF"/>
+                <w:sz w:val="20"/>
+              </w:rPr>
+              <w:t>Medical</w:t>
+            </w:r>
+          </w:p>
+        </w:tc>
+        <w:tc>
+          <w:tcPr>
+            <w:tcW w:type="dxa" w:w="2608"/>
+            <w:shd w:val="clear" w:color="auto" w:fill="0F2E4C"/>
+          </w:tcPr>
+          <w:p>
+            <w:pPr>
+              <w:spacing w:after="0"/>
+            </w:pPr>
+            <w:r/>
+            <w:r>
+              <w:rPr>
+                <w:b/>
+                <w:color w:val="FFFFFF"/>
+                <w:sz w:val="20"/>
+              </w:rPr>
+              <w:t>Detection</w:t>
+            </w:r>
+          </w:p>
+        </w:tc>
+        <w:tc>
+          <w:tcPr>
+            <w:tcW w:type="dxa" w:w="2608"/>
+            <w:shd w:val="clear" w:color="auto" w:fill="0F2E4C"/>
+          </w:tcPr>
+          <w:p>
+            <w:pPr>
+              <w:spacing w:after="0"/>
+            </w:pPr>
+            <w:r/>
+            <w:r>
+              <w:rPr>
+                <w:b/>
+                <w:color w:val="FFFFFF"/>
+                <w:sz w:val="20"/>
+              </w:rPr>
+              <w:t>Photonics</w:t>
+            </w:r>
+          </w:p>
+        </w:tc>
+      </w:tr>
+      <w:tr>
+        <w:tc>
+          <w:tcPr>
+            <w:tcW w:type="dxa" w:w="1701"/>
+          </w:tcPr>
+          <w:p>
+            <w:pPr>
+              <w:spacing w:after="0"/>
+            </w:pPr>
+            <w:r/>
+            <w:r>
+              <w:rPr>
+                <w:b w:val="0"/>
+                <w:color w:val="1F1F1F"/>
+                <w:sz w:val="20"/>
+              </w:rPr>
+              <w:t>TOFU (awareness)</w:t>
+            </w:r>
+          </w:p>
+        </w:tc>
+        <w:tc>
+          <w:tcPr>
+            <w:tcW w:type="dxa" w:w="2608"/>
+          </w:tcPr>
+          <w:p>
+            <w:pPr>
+              <w:spacing w:after="0"/>
+            </w:pPr>
+            <w:r/>
+            <w:r>
+              <w:rPr>
+                <w:b w:val="0"/>
+                <w:color w:val="1F1F1F"/>
+                <w:sz w:val="20"/>
+              </w:rPr>
+              <w:t>Klinische trends, regulatory updates (CE/MDR/IEC), congresreports (ESTRO, RSNA)</w:t>
+            </w:r>
+          </w:p>
+        </w:tc>
+        <w:tc>
+          <w:tcPr>
+            <w:tcW w:type="dxa" w:w="2608"/>
+          </w:tcPr>
+          <w:p>
+            <w:pPr>
+              <w:spacing w:after="0"/>
+            </w:pPr>
+            <w:r/>
+            <w:r>
+              <w:rPr>
+                <w:b w:val="0"/>
+                <w:color w:val="1F1F1F"/>
+                <w:sz w:val="20"/>
+              </w:rPr>
+              <w:t>Compliance-trends (CBRNe, IAEA-richtlijnen), threat-landscape briefings</w:t>
+            </w:r>
+          </w:p>
+        </w:tc>
+        <w:tc>
+          <w:tcPr>
+            <w:tcW w:type="dxa" w:w="2608"/>
+          </w:tcPr>
+          <w:p>
+            <w:pPr>
+              <w:spacing w:after="0"/>
+            </w:pPr>
+            <w:r/>
+            <w:r>
+              <w:rPr>
+                <w:b w:val="0"/>
+                <w:color w:val="1F1F1F"/>
+                <w:sz w:val="20"/>
+              </w:rPr>
+              <w:t>Engineering-blogs: “How to choose a photodiode”, meetfundamentals, app-notes</w:t>
+            </w:r>
+          </w:p>
+        </w:tc>
+      </w:tr>
+      <w:tr>
+        <w:tc>
+          <w:tcPr>
+            <w:tcW w:type="dxa" w:w="1701"/>
+            <w:shd w:val="clear" w:color="auto" w:fill="F4F6F8"/>
+          </w:tcPr>
+          <w:p>
+            <w:pPr>
+              <w:spacing w:after="0"/>
+            </w:pPr>
+            <w:r/>
+            <w:r>
+              <w:rPr>
+                <w:b w:val="0"/>
+                <w:color w:val="1F1F1F"/>
+                <w:sz w:val="20"/>
+              </w:rPr>
+              <w:t>MOFU (consideratie)</w:t>
+            </w:r>
+          </w:p>
+        </w:tc>
+        <w:tc>
+          <w:tcPr>
+            <w:tcW w:type="dxa" w:w="2608"/>
+            <w:shd w:val="clear" w:color="auto" w:fill="F4F6F8"/>
+          </w:tcPr>
+          <w:p>
+            <w:pPr>
+              <w:spacing w:after="0"/>
+            </w:pPr>
+            <w:r/>
+            <w:r>
+              <w:rPr>
+                <w:b w:val="0"/>
+                <w:color w:val="1F1F1F"/>
+                <w:sz w:val="20"/>
+              </w:rPr>
+              <w:t>Vergelijkingen QA-platforms, ROI-calculators, ziekenhuis-cases, on-demand webinars met klinisch fysici</w:t>
+            </w:r>
+          </w:p>
+        </w:tc>
+        <w:tc>
+          <w:tcPr>
+            <w:tcW w:type="dxa" w:w="2608"/>
+            <w:shd w:val="clear" w:color="auto" w:fill="F4F6F8"/>
+          </w:tcPr>
+          <w:p>
+            <w:pPr>
+              <w:spacing w:after="0"/>
+            </w:pPr>
+            <w:r/>
+            <w:r>
+              <w:rPr>
+                <w:b w:val="0"/>
+                <w:color w:val="1F1F1F"/>
+                <w:sz w:val="20"/>
+              </w:rPr>
+              <w:t>Use-case landingspagina's per vertical (Customs / EOD / Nuclear / Defence), proof-of-concept video's</w:t>
+            </w:r>
+          </w:p>
+        </w:tc>
+        <w:tc>
+          <w:tcPr>
+            <w:tcW w:type="dxa" w:w="2608"/>
+            <w:shd w:val="clear" w:color="auto" w:fill="F4F6F8"/>
+          </w:tcPr>
+          <w:p>
+            <w:pPr>
+              <w:spacing w:after="0"/>
+            </w:pPr>
+            <w:r/>
+            <w:r>
+              <w:rPr>
+                <w:b w:val="0"/>
+                <w:color w:val="1F1F1F"/>
+                <w:sz w:val="20"/>
+              </w:rPr>
+              <w:t>Spec-comparison-tabellen, integratiegidsen, CAD-files &amp; datasheet-downloads, demo-loaners</w:t>
+            </w:r>
+          </w:p>
+        </w:tc>
+      </w:tr>
+      <w:tr>
+        <w:tc>
+          <w:tcPr>
+            <w:tcW w:type="dxa" w:w="1701"/>
+          </w:tcPr>
+          <w:p>
+            <w:pPr>
+              <w:spacing w:after="0"/>
+            </w:pPr>
+            <w:r/>
+            <w:r>
+              <w:rPr>
+                <w:b w:val="0"/>
+                <w:color w:val="1F1F1F"/>
+                <w:sz w:val="20"/>
+              </w:rPr>
+              <w:t>BOFU (beslissing)</w:t>
+            </w:r>
+          </w:p>
+        </w:tc>
+        <w:tc>
+          <w:tcPr>
+            <w:tcW w:type="dxa" w:w="2608"/>
+          </w:tcPr>
+          <w:p>
+            <w:pPr>
+              <w:spacing w:after="0"/>
+            </w:pPr>
+            <w:r/>
+            <w:r>
+              <w:rPr>
+                <w:b w:val="0"/>
+                <w:color w:val="1F1F1F"/>
+                <w:sz w:val="20"/>
+              </w:rPr>
+              <w:t>Configurator/quote-formulier per modaliteit, ziekenhuis-referenties, training-/SLA-pakketten</w:t>
+            </w:r>
+          </w:p>
+        </w:tc>
+        <w:tc>
+          <w:tcPr>
+            <w:tcW w:type="dxa" w:w="2608"/>
+          </w:tcPr>
+          <w:p>
+            <w:pPr>
+              <w:spacing w:after="0"/>
+            </w:pPr>
+            <w:r/>
+            <w:r>
+              <w:rPr>
+                <w:b w:val="0"/>
+                <w:color w:val="1F1F1F"/>
+                <w:sz w:val="20"/>
+              </w:rPr>
+              <w:t>Tender-ondersteuning, NDA-gated specs, security-clearance-info</w:t>
+            </w:r>
+          </w:p>
+        </w:tc>
+        <w:tc>
+          <w:tcPr>
+            <w:tcW w:type="dxa" w:w="2608"/>
+          </w:tcPr>
+          <w:p>
+            <w:pPr>
+              <w:spacing w:after="0"/>
+            </w:pPr>
+            <w:r/>
+            <w:r>
+              <w:rPr>
+                <w:b w:val="0"/>
+                <w:color w:val="1F1F1F"/>
+                <w:sz w:val="20"/>
+              </w:rPr>
+              <w:t>Quick-quote per onderdeelnummer, trial units, customer-engineering support</w:t>
+            </w:r>
+          </w:p>
+        </w:tc>
+      </w:tr>
+    </w:tbl>
+    <w:p>
+      <w:pPr>
+        <w:spacing w:after="120"/>
+      </w:pPr>
+      <w:r>
+        <w:rPr>
+          <w:b w:val="0"/>
+          <w:i w:val="0"/>
+          <w:color w:val="1F1F1F"/>
+          <w:sz w:val="22"/>
+        </w:rPr>
+        <w:t xml:space="preserve">Vandaag staat ~80% van de content op alle drie de sites op MOFU/product-categorieniveau. </w:t>
+      </w:r>
+      <w:r>
+        <w:rPr>
+          <w:b/>
+          <w:i w:val="0"/>
+          <w:color w:val="1F1F1F"/>
+          <w:sz w:val="22"/>
+        </w:rPr>
+        <w:t>TOFU en BOFU zijn vrijwel afwezig</w:t>
+      </w:r>
+      <w:r>
+        <w:rPr>
+          <w:b w:val="0"/>
+          <w:i w:val="0"/>
+          <w:color w:val="1F1F1F"/>
+          <w:sz w:val="22"/>
+        </w:rPr>
+        <w:t xml:space="preserve"> — daar zit het organische verkeer dat nu wordt gemist.</w:t>
+      </w:r>
+    </w:p>
+    <w:p>
+      <w:pPr>
+        <w:spacing w:before="200" w:after="80"/>
+      </w:pPr>
+      <w:r>
+        <w:rPr>
+          <w:b/>
+          <w:color w:val="0F2E4C"/>
+          <w:sz w:val="24"/>
+        </w:rPr>
+        <w:t>8.2 Pillar-cluster aanpak per site</w:t>
+      </w:r>
+    </w:p>
+    <w:p>
+      <w:pPr>
+        <w:spacing w:after="120"/>
+      </w:pPr>
+      <w:r>
+        <w:rPr>
+          <w:color w:val="1F1F1F"/>
+          <w:sz w:val="22"/>
+        </w:rPr>
+        <w:t>Per vertical-domein 5-10 pillars (~3000 woorden, hoge waarde) met elk 8-15 supporting articles.</w:t>
+      </w:r>
+    </w:p>
+    <w:p>
+      <w:pPr>
+        <w:spacing w:after="120"/>
+      </w:pPr>
+      <w:r>
+        <w:rPr>
+          <w:b/>
+          <w:i w:val="0"/>
+          <w:color w:val="0F2E4C"/>
+          <w:sz w:val="22"/>
+        </w:rPr>
+        <w:t>peomedical.com</w:t>
+      </w:r>
+    </w:p>
+    <w:p>
+      <w:pPr>
+        <w:pStyle w:val="ListBullet"/>
+        <w:spacing w:after="40"/>
+        <w:ind w:left="340"/>
+      </w:pPr>
+      <w:r>
+        <w:rPr>
+          <w:b w:val="0"/>
+          <w:i w:val="0"/>
+          <w:color w:val="1F1F1F"/>
+          <w:sz w:val="22"/>
+        </w:rPr>
+        <w:t xml:space="preserve">Pillar: </w:t>
+      </w:r>
+      <w:r>
+        <w:rPr>
+          <w:b w:val="0"/>
+          <w:i/>
+          <w:color w:val="1F1F1F"/>
+          <w:sz w:val="22"/>
+        </w:rPr>
+        <w:t>Patient-specific QA in radiotherapy</w:t>
+      </w:r>
+      <w:r>
+        <w:rPr>
+          <w:b w:val="0"/>
+          <w:i w:val="0"/>
+          <w:color w:val="1F1F1F"/>
+          <w:sz w:val="22"/>
+        </w:rPr>
+        <w:t xml:space="preserve"> → cluster: SunCHECK vs Mobius vs RadCalc, in-vivo dosimetrie, machine QA workflows, casus AVL/Erasmus MC, IROC/ESTRO-richtlijnen.</w:t>
+      </w:r>
+    </w:p>
+    <w:p>
+      <w:pPr>
+        <w:pStyle w:val="ListBullet"/>
+        <w:spacing w:after="40"/>
+        <w:ind w:left="340"/>
+      </w:pPr>
+      <w:r>
+        <w:rPr>
+          <w:b w:val="0"/>
+          <w:i w:val="0"/>
+          <w:color w:val="1F1F1F"/>
+          <w:sz w:val="22"/>
+        </w:rPr>
+        <w:t xml:space="preserve">Pillar: </w:t>
+      </w:r>
+      <w:r>
+        <w:rPr>
+          <w:b w:val="0"/>
+          <w:i/>
+          <w:color w:val="1F1F1F"/>
+          <w:sz w:val="22"/>
+        </w:rPr>
+        <w:t>Radiation safety for hospitals</w:t>
+      </w:r>
+      <w:r>
+        <w:rPr>
+          <w:b w:val="0"/>
+          <w:i w:val="0"/>
+          <w:color w:val="1F1F1F"/>
+          <w:sz w:val="22"/>
+        </w:rPr>
+        <w:t xml:space="preserve"> → cluster: persoonlijke dosimetrie, area monitoring, radiologie afscherming, software voor RPA's.</w:t>
+      </w:r>
+    </w:p>
+    <w:p>
+      <w:pPr>
+        <w:spacing w:after="120"/>
+      </w:pPr>
+      <w:r>
+        <w:rPr>
+          <w:b/>
+          <w:i w:val="0"/>
+          <w:color w:val="0F2E4C"/>
+          <w:sz w:val="22"/>
+        </w:rPr>
+        <w:t>peodetection.com</w:t>
+      </w:r>
+    </w:p>
+    <w:p>
+      <w:pPr>
+        <w:pStyle w:val="ListBullet"/>
+        <w:spacing w:after="40"/>
+        <w:ind w:left="340"/>
+      </w:pPr>
+      <w:r>
+        <w:rPr>
+          <w:b w:val="0"/>
+          <w:i w:val="0"/>
+          <w:color w:val="1F1F1F"/>
+          <w:sz w:val="22"/>
+        </w:rPr>
+        <w:t xml:space="preserve">Pillar: </w:t>
+      </w:r>
+      <w:r>
+        <w:rPr>
+          <w:b w:val="0"/>
+          <w:i/>
+          <w:color w:val="1F1F1F"/>
+          <w:sz w:val="22"/>
+        </w:rPr>
+        <w:t>Cargo &amp; vehicle X-ray screening</w:t>
+      </w:r>
+      <w:r>
+        <w:rPr>
+          <w:b w:val="0"/>
+          <w:i w:val="0"/>
+          <w:color w:val="1F1F1F"/>
+          <w:sz w:val="22"/>
+        </w:rPr>
+        <w:t xml:space="preserve"> → cluster: portal-systemen, mobile units, dual-energy vs single, doorvoer per uur, beoordeling false-positives.</w:t>
+      </w:r>
+    </w:p>
+    <w:p>
+      <w:pPr>
+        <w:pStyle w:val="ListBullet"/>
+        <w:spacing w:after="40"/>
+        <w:ind w:left="340"/>
+      </w:pPr>
+      <w:r>
+        <w:rPr>
+          <w:b w:val="0"/>
+          <w:i w:val="0"/>
+          <w:color w:val="1F1F1F"/>
+          <w:sz w:val="22"/>
+        </w:rPr>
+        <w:t xml:space="preserve">Pillar: </w:t>
+      </w:r>
+      <w:r>
+        <w:rPr>
+          <w:b w:val="0"/>
+          <w:i/>
+          <w:color w:val="1F1F1F"/>
+          <w:sz w:val="22"/>
+        </w:rPr>
+        <w:t>Radiation portal monitoring for nuclear power</w:t>
+      </w:r>
+      <w:r>
+        <w:rPr>
+          <w:b w:val="0"/>
+          <w:i w:val="0"/>
+          <w:color w:val="1F1F1F"/>
+          <w:sz w:val="22"/>
+        </w:rPr>
+        <w:t xml:space="preserve"> → cluster: HPGe-detectoren, area monitors, kalibratieservice, traceerbaarheid.</w:t>
+      </w:r>
+    </w:p>
+    <w:p>
+      <w:pPr>
+        <w:spacing w:after="120"/>
+      </w:pPr>
+      <w:r>
+        <w:rPr>
+          <w:b/>
+          <w:i w:val="0"/>
+          <w:color w:val="0F2E4C"/>
+          <w:sz w:val="22"/>
+        </w:rPr>
+        <w:t>peophotonics.com</w:t>
+      </w:r>
+    </w:p>
+    <w:p>
+      <w:pPr>
+        <w:pStyle w:val="ListBullet"/>
+        <w:spacing w:after="40"/>
+        <w:ind w:left="340"/>
+      </w:pPr>
+      <w:r>
+        <w:rPr>
+          <w:b w:val="0"/>
+          <w:i w:val="0"/>
+          <w:color w:val="1F1F1F"/>
+          <w:sz w:val="22"/>
+        </w:rPr>
+        <w:t xml:space="preserve">Pillar: </w:t>
+      </w:r>
+      <w:r>
+        <w:rPr>
+          <w:b w:val="0"/>
+          <w:i/>
+          <w:color w:val="1F1F1F"/>
+          <w:sz w:val="22"/>
+        </w:rPr>
+        <w:t>Position sensitive detection for sub-micron alignment</w:t>
+      </w:r>
+      <w:r>
+        <w:rPr>
+          <w:b w:val="0"/>
+          <w:i w:val="0"/>
+          <w:color w:val="1F1F1F"/>
+          <w:sz w:val="22"/>
+        </w:rPr>
+        <w:t xml:space="preserve"> → cluster: PSDs, SEEPOS, wafer-stage applicaties (semicon), keuzehulp.</w:t>
+      </w:r>
+    </w:p>
+    <w:p>
+      <w:pPr>
+        <w:pStyle w:val="ListBullet"/>
+        <w:spacing w:after="40"/>
+        <w:ind w:left="340"/>
+      </w:pPr>
+      <w:r>
+        <w:rPr>
+          <w:b w:val="0"/>
+          <w:i w:val="0"/>
+          <w:color w:val="1F1F1F"/>
+          <w:sz w:val="22"/>
+        </w:rPr>
+        <w:t xml:space="preserve">Pillar: </w:t>
+      </w:r>
+      <w:r>
+        <w:rPr>
+          <w:b w:val="0"/>
+          <w:i/>
+          <w:color w:val="1F1F1F"/>
+          <w:sz w:val="22"/>
+        </w:rPr>
+        <w:t>Light measurement for LED &amp; display QA</w:t>
+      </w:r>
+      <w:r>
+        <w:rPr>
+          <w:b w:val="0"/>
+          <w:i w:val="0"/>
+          <w:color w:val="1F1F1F"/>
+          <w:sz w:val="22"/>
+        </w:rPr>
+        <w:t xml:space="preserve"> → cluster: spectrometers, photometers, integrating spheres, GL Optic ecosysteem, NEN/DIN-conformiteit.</w:t>
+      </w:r>
+    </w:p>
+    <w:p>
+      <w:pPr>
+        <w:spacing w:after="120"/>
+      </w:pPr>
+      <w:r>
+        <w:rPr>
+          <w:color w:val="1F1F1F"/>
+          <w:sz w:val="22"/>
+        </w:rPr>
+        <w:t>Pillars zijn ook precies de pagina's voor backlink-PR en paid-traffic.</w:t>
+      </w:r>
+    </w:p>
+    <w:p>
+      <w:pPr>
+        <w:spacing w:before="200" w:after="80"/>
+      </w:pPr>
+      <w:r>
+        <w:rPr>
+          <w:b/>
+          <w:color w:val="0F2E4C"/>
+          <w:sz w:val="24"/>
+        </w:rPr>
+        <w:t>8.3 Content-formats die voor B2B/distributie hard werken</w:t>
+      </w:r>
+    </w:p>
+    <w:p>
+      <w:pPr>
+        <w:pStyle w:val="ListBullet"/>
+        <w:spacing w:after="40"/>
+        <w:ind w:left="340"/>
+      </w:pPr>
+      <w:r>
+        <w:rPr>
+          <w:b/>
+          <w:i w:val="0"/>
+          <w:color w:val="1F1F1F"/>
+          <w:sz w:val="22"/>
+        </w:rPr>
+        <w:t>Casestudies/referenties</w:t>
+      </w:r>
+      <w:r>
+        <w:rPr>
+          <w:b w:val="0"/>
+          <w:i w:val="0"/>
+          <w:color w:val="1F1F1F"/>
+          <w:sz w:val="22"/>
+        </w:rPr>
+        <w:t xml:space="preserve"> (1 per kwartaal per vertical). Medical heeft 100+ ziekenhuizen — daar liggen verhalen. Video + geschreven artikel.</w:t>
+      </w:r>
+    </w:p>
+    <w:p>
+      <w:pPr>
+        <w:pStyle w:val="ListBullet"/>
+        <w:spacing w:after="40"/>
+        <w:ind w:left="340"/>
+      </w:pPr>
+      <w:r>
+        <w:rPr>
+          <w:b/>
+          <w:i w:val="0"/>
+          <w:color w:val="1F1F1F"/>
+          <w:sz w:val="22"/>
+        </w:rPr>
+        <w:t>Datasheet-hub met gated downloads</w:t>
+      </w:r>
+      <w:r>
+        <w:rPr>
+          <w:b w:val="0"/>
+          <w:i w:val="0"/>
+          <w:color w:val="1F1F1F"/>
+          <w:sz w:val="22"/>
+        </w:rPr>
+        <w:t xml:space="preserve"> = HubSpot-lead met productinteresse. Photonics is bij uitstek geschikt.</w:t>
+      </w:r>
+    </w:p>
+    <w:p>
+      <w:pPr>
+        <w:pStyle w:val="ListBullet"/>
+        <w:spacing w:after="40"/>
+        <w:ind w:left="340"/>
+      </w:pPr>
+      <w:r>
+        <w:rPr>
+          <w:b/>
+          <w:i w:val="0"/>
+          <w:color w:val="1F1F1F"/>
+          <w:sz w:val="22"/>
+        </w:rPr>
+        <w:t>Webinars / on-demand replays.</w:t>
+      </w:r>
+      <w:r>
+        <w:rPr>
+          <w:b w:val="0"/>
+          <w:i w:val="0"/>
+          <w:color w:val="1F1F1F"/>
+          <w:sz w:val="22"/>
+        </w:rPr>
+        <w:t xml:space="preserve"> Werkt goed in medical en detection. Co-branded met partner-fabrikanten (Sun Nuclear, GL Optic, CEIA …) = audience-share zonder eigen mediabudget.</w:t>
+      </w:r>
+    </w:p>
+    <w:p>
+      <w:pPr>
+        <w:pStyle w:val="ListBullet"/>
+        <w:spacing w:after="40"/>
+        <w:ind w:left="340"/>
+      </w:pPr>
+      <w:r>
+        <w:rPr>
+          <w:b/>
+          <w:i w:val="0"/>
+          <w:color w:val="1F1F1F"/>
+          <w:sz w:val="22"/>
+        </w:rPr>
+        <w:t>Tools/calculators</w:t>
+      </w:r>
+      <w:r>
+        <w:rPr>
+          <w:b w:val="0"/>
+          <w:i w:val="0"/>
+          <w:color w:val="1F1F1F"/>
+          <w:sz w:val="22"/>
+        </w:rPr>
+        <w:t xml:space="preserve"> (X-ray rental ROI, PSD distance-to-resolution selector). Genereert backlinks en sessietijd.</w:t>
+      </w:r>
+    </w:p>
+    <w:p>
+      <w:pPr>
+        <w:pStyle w:val="ListBullet"/>
+        <w:spacing w:after="40"/>
+        <w:ind w:left="340"/>
+      </w:pPr>
+      <w:r>
+        <w:rPr>
+          <w:b/>
+          <w:i w:val="0"/>
+          <w:color w:val="1F1F1F"/>
+          <w:sz w:val="22"/>
+        </w:rPr>
+        <w:t>Glossary / kennisbank</w:t>
+      </w:r>
+      <w:r>
+        <w:rPr>
+          <w:b w:val="0"/>
+          <w:i w:val="0"/>
+          <w:color w:val="1F1F1F"/>
+          <w:sz w:val="22"/>
+        </w:rPr>
+        <w:t xml:space="preserve"> per site. Pakt veel longtail-searches.</w:t>
+      </w:r>
+    </w:p>
+    <w:p>
+      <w:pPr>
+        <w:spacing w:before="200" w:after="80"/>
+      </w:pPr>
+      <w:r>
+        <w:rPr>
+          <w:b/>
+          <w:color w:val="0F2E4C"/>
+          <w:sz w:val="24"/>
+        </w:rPr>
+        <w:t>8.4 Vertaling / lokalisatie</w:t>
+      </w:r>
+    </w:p>
+    <w:p>
+      <w:pPr>
+        <w:spacing w:after="120"/>
+      </w:pPr>
+      <w:r>
+        <w:rPr>
+          <w:b w:val="0"/>
+          <w:i w:val="0"/>
+          <w:color w:val="1F1F1F"/>
+          <w:sz w:val="22"/>
+        </w:rPr>
+        <w:t xml:space="preserve">PEO bedient BeNeLux + EU. Photonics heeft /nl/. Aanbeveling: </w:t>
+      </w:r>
+      <w:r>
+        <w:rPr>
+          <w:b/>
+          <w:i w:val="0"/>
+          <w:color w:val="1F1F1F"/>
+          <w:sz w:val="22"/>
+        </w:rPr>
+        <w:t>EN als hoofdsysteem, NL voor NL/BE, FR voor BE-Wallonie</w:t>
+      </w:r>
+      <w:r>
+        <w:rPr>
+          <w:b w:val="0"/>
+          <w:i w:val="0"/>
+          <w:color w:val="1F1F1F"/>
+          <w:sz w:val="22"/>
+        </w:rPr>
+        <w:t>, met goede hreflang + x-default. Detection en Medical hebben nu geen NL — terwijl 100+ NL/BE-ziekenhuizen klant zijn. Daar laat je organische zichtbaarheid liggen.</w:t>
+      </w:r>
+    </w:p>
+    <w:p>
+      <w:pPr>
+        <w:spacing w:before="200" w:after="80"/>
+      </w:pPr>
+      <w:r>
+        <w:rPr>
+          <w:b/>
+          <w:color w:val="0F2E4C"/>
+          <w:sz w:val="24"/>
+        </w:rPr>
+        <w:t>8.5 Owned audience opbouwen</w:t>
+      </w:r>
+    </w:p>
+    <w:p>
+      <w:pPr>
+        <w:pStyle w:val="ListBullet"/>
+        <w:spacing w:after="40"/>
+        <w:ind w:left="340"/>
+      </w:pPr>
+      <w:r>
+        <w:rPr>
+          <w:b/>
+          <w:i w:val="0"/>
+          <w:color w:val="1F1F1F"/>
+          <w:sz w:val="22"/>
+        </w:rPr>
+        <w:t>Eén nieuwsbrief per vertical</w:t>
+      </w:r>
+      <w:r>
+        <w:rPr>
+          <w:b w:val="0"/>
+          <w:i w:val="0"/>
+          <w:color w:val="1F1F1F"/>
+          <w:sz w:val="22"/>
+        </w:rPr>
+        <w:t xml:space="preserve"> (niet één voor alles). Maandelijks: productnieuws + 1 thought-leadership artikel.</w:t>
+      </w:r>
+    </w:p>
+    <w:p>
+      <w:pPr>
+        <w:pStyle w:val="ListBullet"/>
+        <w:spacing w:after="40"/>
+        <w:ind w:left="340"/>
+      </w:pPr>
+      <w:r>
+        <w:rPr>
+          <w:b/>
+          <w:i w:val="0"/>
+          <w:color w:val="1F1F1F"/>
+          <w:sz w:val="22"/>
+        </w:rPr>
+        <w:t>LinkedIn:</w:t>
+      </w:r>
+      <w:r>
+        <w:rPr>
+          <w:b w:val="0"/>
+          <w:i w:val="0"/>
+          <w:color w:val="1F1F1F"/>
+          <w:sz w:val="22"/>
+        </w:rPr>
+        <w:t xml:space="preserve"> PEO heeft één gedeelde company page voor alle business lines. Overweeg </w:t>
+      </w:r>
+      <w:r>
+        <w:rPr>
+          <w:b w:val="0"/>
+          <w:i/>
+          <w:color w:val="1F1F1F"/>
+          <w:sz w:val="22"/>
+        </w:rPr>
+        <w:t>showcase pages</w:t>
+      </w:r>
+      <w:r>
+        <w:rPr>
+          <w:b w:val="0"/>
+          <w:i w:val="0"/>
+          <w:color w:val="1F1F1F"/>
+          <w:sz w:val="22"/>
+        </w:rPr>
+        <w:t xml:space="preserve"> per vertical onder de hoofdpagina — scherpere targeting, betere volger-segmentatie.</w:t>
+      </w:r>
+    </w:p>
+    <w:p>
+      <w:pPr>
+        <w:spacing w:before="320" w:after="120"/>
+        <w:pBdr>
+          <w:bottom w:val="single" w:sz="6" w:space="1" w:color="F0801F"/>
+        </w:pBdr>
+      </w:pPr>
+      <w:r>
+        <w:rPr>
+          <w:b/>
+          <w:color w:val="0F2E4C"/>
+          <w:sz w:val="30"/>
+        </w:rPr>
+        <w:t>9. Paid Media-strategie</w:t>
+      </w:r>
+    </w:p>
+    <w:p>
+      <w:pPr>
+        <w:spacing w:before="200" w:after="80"/>
+      </w:pPr>
+      <w:r>
+        <w:rPr>
+          <w:b/>
+          <w:color w:val="0F2E4C"/>
+          <w:sz w:val="24"/>
+        </w:rPr>
+        <w:t>9.1 Kanaalkeuze per vertical</w:t>
+      </w:r>
+    </w:p>
+    <w:tbl>
+      <w:tblPr>
+        <w:tblStyle w:val="LightGrid-Accent1"/>
+        <w:tblW w:type="auto" w:w="0"/>
+        <w:tblLayout w:type="autofit"/>
+        <w:tblLook w:firstColumn="1" w:firstRow="1" w:lastColumn="0" w:lastRow="0" w:noHBand="0" w:noVBand="1" w:val="04A0"/>
+      </w:tblPr>
+      <w:tblGrid>
+        <w:gridCol w:w="2436"/>
+        <w:gridCol w:w="2436"/>
+        <w:gridCol w:w="2436"/>
+        <w:gridCol w:w="2436"/>
+      </w:tblGrid>
+      <w:tr>
+        <w:tc>
+          <w:tcPr>
+            <w:tcW w:type="dxa" w:w="1984"/>
+            <w:shd w:val="clear" w:color="auto" w:fill="0F2E4C"/>
+          </w:tcPr>
+          <w:p>
+            <w:pPr>
+              <w:spacing w:after="0"/>
+            </w:pPr>
+            <w:r/>
+            <w:r>
+              <w:rPr>
+                <w:b/>
+                <w:color w:val="FFFFFF"/>
+                <w:sz w:val="20"/>
+              </w:rPr>
+              <w:t>Kanaal</w:t>
+            </w:r>
+          </w:p>
+        </w:tc>
+        <w:tc>
+          <w:tcPr>
+            <w:tcW w:type="dxa" w:w="2381"/>
+            <w:shd w:val="clear" w:color="auto" w:fill="0F2E4C"/>
+          </w:tcPr>
+          <w:p>
+            <w:pPr>
+              <w:spacing w:after="0"/>
+            </w:pPr>
+            <w:r/>
+            <w:r>
+              <w:rPr>
+                <w:b/>
+                <w:color w:val="FFFFFF"/>
+                <w:sz w:val="20"/>
+              </w:rPr>
+              <w:t>Medical</w:t>
+            </w:r>
+          </w:p>
+        </w:tc>
+        <w:tc>
+          <w:tcPr>
+            <w:tcW w:type="dxa" w:w="2381"/>
+            <w:shd w:val="clear" w:color="auto" w:fill="0F2E4C"/>
+          </w:tcPr>
+          <w:p>
+            <w:pPr>
+              <w:spacing w:after="0"/>
+            </w:pPr>
+            <w:r/>
+            <w:r>
+              <w:rPr>
+                <w:b/>
+                <w:color w:val="FFFFFF"/>
+                <w:sz w:val="20"/>
+              </w:rPr>
+              <w:t>Detection</w:t>
+            </w:r>
+          </w:p>
+        </w:tc>
+        <w:tc>
+          <w:tcPr>
+            <w:tcW w:type="dxa" w:w="2381"/>
+            <w:shd w:val="clear" w:color="auto" w:fill="0F2E4C"/>
+          </w:tcPr>
+          <w:p>
+            <w:pPr>
+              <w:spacing w:after="0"/>
+            </w:pPr>
+            <w:r/>
+            <w:r>
+              <w:rPr>
+                <w:b/>
+                <w:color w:val="FFFFFF"/>
+                <w:sz w:val="20"/>
+              </w:rPr>
+              <w:t>Photonics</w:t>
+            </w:r>
+          </w:p>
+        </w:tc>
+      </w:tr>
+      <w:tr>
+        <w:tc>
+          <w:tcPr>
+            <w:tcW w:type="dxa" w:w="1984"/>
+          </w:tcPr>
+          <w:p>
+            <w:pPr>
+              <w:spacing w:after="0"/>
+            </w:pPr>
+            <w:r/>
+            <w:r>
+              <w:rPr>
+                <w:b w:val="0"/>
+                <w:color w:val="1F1F1F"/>
+                <w:sz w:val="20"/>
+              </w:rPr>
+              <w:t>Google Search</w:t>
+            </w:r>
+          </w:p>
+        </w:tc>
+        <w:tc>
+          <w:tcPr>
+            <w:tcW w:type="dxa" w:w="2381"/>
+          </w:tcPr>
+          <w:p>
+            <w:pPr>
+              <w:spacing w:after="0"/>
+            </w:pPr>
+            <w:r/>
+            <w:r>
+              <w:rPr>
+                <w:b w:val="0"/>
+                <w:color w:val="1F1F1F"/>
+                <w:sz w:val="20"/>
+              </w:rPr>
+              <w:t>★★★ kerngedreven door specifieke productnamen + use-cases</w:t>
+            </w:r>
+          </w:p>
+        </w:tc>
+        <w:tc>
+          <w:tcPr>
+            <w:tcW w:type="dxa" w:w="2381"/>
+          </w:tcPr>
+          <w:p>
+            <w:pPr>
+              <w:spacing w:after="0"/>
+            </w:pPr>
+            <w:r/>
+            <w:r>
+              <w:rPr>
+                <w:b w:val="0"/>
+                <w:color w:val="1F1F1F"/>
+                <w:sz w:val="20"/>
+              </w:rPr>
+              <w:t>★★ veel zoekvolume rond compliance-termen</w:t>
+            </w:r>
+          </w:p>
+        </w:tc>
+        <w:tc>
+          <w:tcPr>
+            <w:tcW w:type="dxa" w:w="2381"/>
+          </w:tcPr>
+          <w:p>
+            <w:pPr>
+              <w:spacing w:after="0"/>
+            </w:pPr>
+            <w:r/>
+            <w:r>
+              <w:rPr>
+                <w:b w:val="0"/>
+                <w:color w:val="1F1F1F"/>
+                <w:sz w:val="20"/>
+              </w:rPr>
+              <w:t>★★★ engineers zoeken op part numbers / specs</w:t>
+            </w:r>
+          </w:p>
+        </w:tc>
+      </w:tr>
+      <w:tr>
+        <w:tc>
+          <w:tcPr>
+            <w:tcW w:type="dxa" w:w="1984"/>
+            <w:shd w:val="clear" w:color="auto" w:fill="F4F6F8"/>
+          </w:tcPr>
+          <w:p>
+            <w:pPr>
+              <w:spacing w:after="0"/>
+            </w:pPr>
+            <w:r/>
+            <w:r>
+              <w:rPr>
+                <w:b w:val="0"/>
+                <w:color w:val="1F1F1F"/>
+                <w:sz w:val="20"/>
+              </w:rPr>
+              <w:t>Google Display + Performance Max</w:t>
+            </w:r>
+          </w:p>
+        </w:tc>
+        <w:tc>
+          <w:tcPr>
+            <w:tcW w:type="dxa" w:w="2381"/>
+            <w:shd w:val="clear" w:color="auto" w:fill="F4F6F8"/>
+          </w:tcPr>
+          <w:p>
+            <w:pPr>
+              <w:spacing w:after="0"/>
+            </w:pPr>
+            <w:r/>
+            <w:r>
+              <w:rPr>
+                <w:b w:val="0"/>
+                <w:color w:val="1F1F1F"/>
+                <w:sz w:val="20"/>
+              </w:rPr>
+              <w:t>★ contextueel op medische publicaties</w:t>
+            </w:r>
+          </w:p>
+        </w:tc>
+        <w:tc>
+          <w:tcPr>
+            <w:tcW w:type="dxa" w:w="2381"/>
+            <w:shd w:val="clear" w:color="auto" w:fill="F4F6F8"/>
+          </w:tcPr>
+          <w:p>
+            <w:pPr>
+              <w:spacing w:after="0"/>
+            </w:pPr>
+            <w:r/>
+            <w:r>
+              <w:rPr>
+                <w:b w:val="0"/>
+                <w:color w:val="1F1F1F"/>
+                <w:sz w:val="20"/>
+              </w:rPr>
+              <w:t>★ alleen retargeting</w:t>
+            </w:r>
+          </w:p>
+        </w:tc>
+        <w:tc>
+          <w:tcPr>
+            <w:tcW w:type="dxa" w:w="2381"/>
+            <w:shd w:val="clear" w:color="auto" w:fill="F4F6F8"/>
+          </w:tcPr>
+          <w:p>
+            <w:pPr>
+              <w:spacing w:after="0"/>
+            </w:pPr>
+            <w:r/>
+            <w:r>
+              <w:rPr>
+                <w:b w:val="0"/>
+                <w:color w:val="1F1F1F"/>
+                <w:sz w:val="20"/>
+              </w:rPr>
+              <w:t>★★ retargeting + tech-publishers</w:t>
+            </w:r>
+          </w:p>
+        </w:tc>
+      </w:tr>
+      <w:tr>
+        <w:tc>
+          <w:tcPr>
+            <w:tcW w:type="dxa" w:w="1984"/>
+          </w:tcPr>
+          <w:p>
+            <w:pPr>
+              <w:spacing w:after="0"/>
+            </w:pPr>
+            <w:r/>
+            <w:r>
+              <w:rPr>
+                <w:b w:val="0"/>
+                <w:color w:val="1F1F1F"/>
+                <w:sz w:val="20"/>
+              </w:rPr>
+              <w:t>LinkedIn Ads</w:t>
+            </w:r>
+          </w:p>
+        </w:tc>
+        <w:tc>
+          <w:tcPr>
+            <w:tcW w:type="dxa" w:w="2381"/>
+          </w:tcPr>
+          <w:p>
+            <w:pPr>
+              <w:spacing w:after="0"/>
+            </w:pPr>
+            <w:r/>
+            <w:r>
+              <w:rPr>
+                <w:b w:val="0"/>
+                <w:color w:val="1F1F1F"/>
+                <w:sz w:val="20"/>
+              </w:rPr>
+              <w:t>★★★ targetbaar op job titles (medical physicist, radiation oncologist)</w:t>
+            </w:r>
+          </w:p>
+        </w:tc>
+        <w:tc>
+          <w:tcPr>
+            <w:tcW w:type="dxa" w:w="2381"/>
+          </w:tcPr>
+          <w:p>
+            <w:pPr>
+              <w:spacing w:after="0"/>
+            </w:pPr>
+            <w:r/>
+            <w:r>
+              <w:rPr>
+                <w:b w:val="0"/>
+                <w:color w:val="1F1F1F"/>
+                <w:sz w:val="20"/>
+              </w:rPr>
+              <w:t>★★★ defence/customs/security-titels (moeilijker bereikbaar)</w:t>
+            </w:r>
+          </w:p>
+        </w:tc>
+        <w:tc>
+          <w:tcPr>
+            <w:tcW w:type="dxa" w:w="2381"/>
+          </w:tcPr>
+          <w:p>
+            <w:pPr>
+              <w:spacing w:after="0"/>
+            </w:pPr>
+            <w:r/>
+            <w:r>
+              <w:rPr>
+                <w:b w:val="0"/>
+                <w:color w:val="1F1F1F"/>
+                <w:sz w:val="20"/>
+              </w:rPr>
+              <w:t>★★ R&amp;D engineers, principal engineer in semicon/aerospace</w:t>
+            </w:r>
+          </w:p>
+        </w:tc>
+      </w:tr>
+      <w:tr>
+        <w:tc>
+          <w:tcPr>
+            <w:tcW w:type="dxa" w:w="1984"/>
+            <w:shd w:val="clear" w:color="auto" w:fill="F4F6F8"/>
+          </w:tcPr>
+          <w:p>
+            <w:pPr>
+              <w:spacing w:after="0"/>
+            </w:pPr>
+            <w:r/>
+            <w:r>
+              <w:rPr>
+                <w:b w:val="0"/>
+                <w:color w:val="1F1F1F"/>
+                <w:sz w:val="20"/>
+              </w:rPr>
+              <w:t>YouTube</w:t>
+            </w:r>
+          </w:p>
+        </w:tc>
+        <w:tc>
+          <w:tcPr>
+            <w:tcW w:type="dxa" w:w="2381"/>
+            <w:shd w:val="clear" w:color="auto" w:fill="F4F6F8"/>
+          </w:tcPr>
+          <w:p>
+            <w:pPr>
+              <w:spacing w:after="0"/>
+            </w:pPr>
+            <w:r/>
+            <w:r>
+              <w:rPr>
+                <w:b w:val="0"/>
+                <w:color w:val="1F1F1F"/>
+                <w:sz w:val="20"/>
+              </w:rPr>
+              <w:t>★★ uitleg-/casus-video's</w:t>
+            </w:r>
+          </w:p>
+        </w:tc>
+        <w:tc>
+          <w:tcPr>
+            <w:tcW w:type="dxa" w:w="2381"/>
+            <w:shd w:val="clear" w:color="auto" w:fill="F4F6F8"/>
+          </w:tcPr>
+          <w:p>
+            <w:pPr>
+              <w:spacing w:after="0"/>
+            </w:pPr>
+            <w:r/>
+            <w:r>
+              <w:rPr>
+                <w:b w:val="0"/>
+                <w:color w:val="1F1F1F"/>
+                <w:sz w:val="20"/>
+              </w:rPr>
+              <w:t>★ beperkt</w:t>
+            </w:r>
+          </w:p>
+        </w:tc>
+        <w:tc>
+          <w:tcPr>
+            <w:tcW w:type="dxa" w:w="2381"/>
+            <w:shd w:val="clear" w:color="auto" w:fill="F4F6F8"/>
+          </w:tcPr>
+          <w:p>
+            <w:pPr>
+              <w:spacing w:after="0"/>
+            </w:pPr>
+            <w:r/>
+            <w:r>
+              <w:rPr>
+                <w:b w:val="0"/>
+                <w:color w:val="1F1F1F"/>
+                <w:sz w:val="20"/>
+              </w:rPr>
+              <w:t>★★ pre-roll voor electronics/photonics-content</w:t>
+            </w:r>
+          </w:p>
+        </w:tc>
+      </w:tr>
+      <w:tr>
+        <w:tc>
+          <w:tcPr>
+            <w:tcW w:type="dxa" w:w="1984"/>
+          </w:tcPr>
+          <w:p>
+            <w:pPr>
+              <w:spacing w:after="0"/>
+            </w:pPr>
+            <w:r/>
+            <w:r>
+              <w:rPr>
+                <w:b w:val="0"/>
+                <w:color w:val="1F1F1F"/>
+                <w:sz w:val="20"/>
+              </w:rPr>
+              <w:t>Industry trade media</w:t>
+            </w:r>
+          </w:p>
+        </w:tc>
+        <w:tc>
+          <w:tcPr>
+            <w:tcW w:type="dxa" w:w="2381"/>
+          </w:tcPr>
+          <w:p>
+            <w:pPr>
+              <w:spacing w:after="0"/>
+            </w:pPr>
+            <w:r/>
+            <w:r>
+              <w:rPr>
+                <w:b w:val="0"/>
+                <w:color w:val="1F1F1F"/>
+                <w:sz w:val="20"/>
+              </w:rPr>
+              <w:t>★★ AuntMinnie, Medical Physics Web, RadiologyToday</w:t>
+            </w:r>
+          </w:p>
+        </w:tc>
+        <w:tc>
+          <w:tcPr>
+            <w:tcW w:type="dxa" w:w="2381"/>
+          </w:tcPr>
+          <w:p>
+            <w:pPr>
+              <w:spacing w:after="0"/>
+            </w:pPr>
+            <w:r/>
+            <w:r>
+              <w:rPr>
+                <w:b w:val="0"/>
+                <w:color w:val="1F1F1F"/>
+                <w:sz w:val="20"/>
+              </w:rPr>
+              <w:t>★★★ Defense News, Jane's, IAEA-publicaties</w:t>
+            </w:r>
+          </w:p>
+        </w:tc>
+        <w:tc>
+          <w:tcPr>
+            <w:tcW w:type="dxa" w:w="2381"/>
+          </w:tcPr>
+          <w:p>
+            <w:pPr>
+              <w:spacing w:after="0"/>
+            </w:pPr>
+            <w:r/>
+            <w:r>
+              <w:rPr>
+                <w:b w:val="0"/>
+                <w:color w:val="1F1F1F"/>
+                <w:sz w:val="20"/>
+              </w:rPr>
+              <w:t>★★ Photonics.com, Laser Focus World, Optics &amp; Photonics News</w:t>
+            </w:r>
+          </w:p>
+        </w:tc>
+      </w:tr>
+      <w:tr>
+        <w:tc>
+          <w:tcPr>
+            <w:tcW w:type="dxa" w:w="1984"/>
+            <w:shd w:val="clear" w:color="auto" w:fill="F4F6F8"/>
+          </w:tcPr>
+          <w:p>
+            <w:pPr>
+              <w:spacing w:after="0"/>
+            </w:pPr>
+            <w:r/>
+            <w:r>
+              <w:rPr>
+                <w:b w:val="0"/>
+                <w:color w:val="1F1F1F"/>
+                <w:sz w:val="20"/>
+              </w:rPr>
+              <w:t>Trade shows &amp; sponsoring</w:t>
+            </w:r>
+          </w:p>
+        </w:tc>
+        <w:tc>
+          <w:tcPr>
+            <w:tcW w:type="dxa" w:w="2381"/>
+            <w:shd w:val="clear" w:color="auto" w:fill="F4F6F8"/>
+          </w:tcPr>
+          <w:p>
+            <w:pPr>
+              <w:spacing w:after="0"/>
+            </w:pPr>
+            <w:r/>
+            <w:r>
+              <w:rPr>
+                <w:b w:val="0"/>
+                <w:color w:val="1F1F1F"/>
+                <w:sz w:val="20"/>
+              </w:rPr>
+              <w:t>★★★ ESTRO, RSNA, ECR</w:t>
+            </w:r>
+          </w:p>
+        </w:tc>
+        <w:tc>
+          <w:tcPr>
+            <w:tcW w:type="dxa" w:w="2381"/>
+            <w:shd w:val="clear" w:color="auto" w:fill="F4F6F8"/>
+          </w:tcPr>
+          <w:p>
+            <w:pPr>
+              <w:spacing w:after="0"/>
+            </w:pPr>
+            <w:r/>
+            <w:r>
+              <w:rPr>
+                <w:b w:val="0"/>
+                <w:color w:val="1F1F1F"/>
+                <w:sz w:val="20"/>
+              </w:rPr>
+              <w:t>★★★ DSEI, Milipol, World Customs Org</w:t>
+            </w:r>
+          </w:p>
+        </w:tc>
+        <w:tc>
+          <w:tcPr>
+            <w:tcW w:type="dxa" w:w="2381"/>
+            <w:shd w:val="clear" w:color="auto" w:fill="F4F6F8"/>
+          </w:tcPr>
+          <w:p>
+            <w:pPr>
+              <w:spacing w:after="0"/>
+            </w:pPr>
+            <w:r/>
+            <w:r>
+              <w:rPr>
+                <w:b w:val="0"/>
+                <w:color w:val="1F1F1F"/>
+                <w:sz w:val="20"/>
+              </w:rPr>
+              <w:t>★★ SPIE Photonics West, Laser World of Photonics</w:t>
+            </w:r>
+          </w:p>
+        </w:tc>
+      </w:tr>
+    </w:tbl>
+    <w:p>
+      <w:pPr>
+        <w:spacing w:before="200" w:after="80"/>
+      </w:pPr>
+      <w:r>
+        <w:rPr>
+          <w:b/>
+          <w:color w:val="0F2E4C"/>
+          <w:sz w:val="24"/>
+        </w:rPr>
+        <w:t>9.2 Concrete campagne-architectuur</w:t>
+      </w:r>
+    </w:p>
+    <w:p>
+      <w:pPr>
+        <w:spacing w:after="120"/>
+      </w:pPr>
+      <w:r>
+        <w:rPr>
+          <w:color w:val="1F1F1F"/>
+          <w:sz w:val="22"/>
+        </w:rPr>
+        <w:t>Drie aparte ad-accounts (of minimaal aparte sub-accounts/labels) — niet één PEO-account dat alles vermengt.</w:t>
+      </w:r>
+    </w:p>
+    <w:p>
+      <w:pPr>
+        <w:spacing w:after="120"/>
+      </w:pPr>
+      <w:r>
+        <w:rPr>
+          <w:b/>
+          <w:i w:val="0"/>
+          <w:color w:val="1F1F1F"/>
+          <w:sz w:val="22"/>
+        </w:rPr>
+        <w:t>Per vertical 4 lagen:</w:t>
+      </w:r>
+    </w:p>
+    <w:p>
+      <w:pPr>
+        <w:pStyle w:val="ListNumber"/>
+        <w:spacing w:after="40"/>
+      </w:pPr>
+      <w:r>
+        <w:rPr>
+          <w:b/>
+          <w:color w:val="1F1F1F"/>
+          <w:sz w:val="22"/>
+        </w:rPr>
+        <w:t>Brand defence search</w:t>
+      </w:r>
+      <w:r>
+        <w:rPr>
+          <w:color w:val="1F1F1F"/>
+          <w:sz w:val="22"/>
+        </w:rPr>
+        <w:t xml:space="preserve"> (always-on, klein budget). Bid op “PEO Medical”, “PEO Detection”, “PEO Photonics”, “gotopeo”, productpartner-namen (“SunCHECK distributor BeNeLux”). Voorkom dat concurrenten/resellers boven je staan.</w:t>
+      </w:r>
+    </w:p>
+    <w:p>
+      <w:pPr>
+        <w:pStyle w:val="ListNumber"/>
+        <w:spacing w:after="40"/>
+      </w:pPr>
+      <w:r>
+        <w:rPr>
+          <w:b/>
+          <w:color w:val="1F1F1F"/>
+          <w:sz w:val="22"/>
+        </w:rPr>
+        <w:t>High-intent non-brand search</w:t>
+      </w:r>
+      <w:r>
+        <w:rPr>
+          <w:color w:val="1F1F1F"/>
+          <w:sz w:val="22"/>
+        </w:rPr>
+        <w:t xml:space="preserve"> (60-70% budget). Long-tail B2B-termen (“radiation portal monitor BeNeLux”, “silicon photodiode integrated amplifier”, “patient QA radiotherapy software”). Stuur naar use-case landingspagina's, niet de homepage. Pure phrase/exact match, geen brede match zonder smart-bidding én ruime negative-list.</w:t>
+      </w:r>
+    </w:p>
+    <w:p>
+      <w:pPr>
+        <w:pStyle w:val="ListNumber"/>
+        <w:spacing w:after="40"/>
+      </w:pPr>
+      <w:r>
+        <w:rPr>
+          <w:b/>
+          <w:color w:val="1F1F1F"/>
+          <w:sz w:val="22"/>
+        </w:rPr>
+        <w:t>LinkedIn ABM</w:t>
+      </w:r>
+      <w:r>
+        <w:rPr>
+          <w:color w:val="1F1F1F"/>
+          <w:sz w:val="22"/>
+        </w:rPr>
+        <w:t xml:space="preserve"> (20-30% budget).</w:t>
+      </w:r>
+    </w:p>
+    <w:p>
+      <w:pPr>
+        <w:pStyle w:val="ListBullet"/>
+        <w:spacing w:after="40"/>
+        <w:ind w:left="680"/>
+      </w:pPr>
+      <w:r>
+        <w:rPr>
+          <w:color w:val="1F1F1F"/>
+          <w:sz w:val="22"/>
+        </w:rPr>
+        <w:t>Medical: Medical Physicist, Radiation Oncologist, Radiation Therapist, NL/BE/DE bij ziekenhuizen &gt;250 fte. Lead-gen-formulier op cases/webinar.</w:t>
+      </w:r>
+    </w:p>
+    <w:p>
+      <w:pPr>
+        <w:pStyle w:val="ListBullet"/>
+        <w:spacing w:after="40"/>
+        <w:ind w:left="680"/>
+      </w:pPr>
+      <w:r>
+        <w:rPr>
+          <w:color w:val="1F1F1F"/>
+          <w:sz w:val="22"/>
+        </w:rPr>
+        <w:t>Detection: account-based-targeting op specifieke organisaties (Belgische Defensie, NL Douane, COVRA, NRG Petten, …) i.p.v. job-title-targeting.</w:t>
+      </w:r>
+    </w:p>
+    <w:p>
+      <w:pPr>
+        <w:pStyle w:val="ListBullet"/>
+        <w:spacing w:after="40"/>
+        <w:ind w:left="680"/>
+      </w:pPr>
+      <w:r>
+        <w:rPr>
+          <w:color w:val="1F1F1F"/>
+          <w:sz w:val="22"/>
+        </w:rPr>
+        <w:t>Photonics: Optical Engineer, R&amp;D Engineer Semicon, Principal Engineer Photonics bij ASML/Thermo Fisher/TNO/imec.</w:t>
+      </w:r>
+    </w:p>
+    <w:p>
+      <w:pPr>
+        <w:pStyle w:val="ListBullet"/>
+        <w:spacing w:after="40"/>
+        <w:ind w:left="680"/>
+      </w:pPr>
+      <w:r>
+        <w:rPr>
+          <w:color w:val="1F1F1F"/>
+          <w:sz w:val="22"/>
+        </w:rPr>
+        <w:t>Format: Document Ads (datasheets) en Conversation Ads voor demo-aanvragen.</w:t>
+      </w:r>
+    </w:p>
+    <w:p>
+      <w:pPr>
+        <w:pStyle w:val="ListNumber"/>
+        <w:spacing w:after="40"/>
+      </w:pPr>
+      <w:r>
+        <w:rPr>
+          <w:b/>
+          <w:color w:val="1F1F1F"/>
+          <w:sz w:val="22"/>
+        </w:rPr>
+        <w:t>Retargeting</w:t>
+      </w:r>
+      <w:r>
+        <w:rPr>
+          <w:color w:val="1F1F1F"/>
+          <w:sz w:val="22"/>
+        </w:rPr>
+        <w:t xml:space="preserve"> (5-10% budget). Bezoekers van pillar-pagina's terughalen met cases/demo. Per vertical apart — geen radiotherapie-ad voor een photonics-bezoeker.</w:t>
+      </w:r>
+    </w:p>
+    <w:p>
+      <w:pPr>
+        <w:spacing w:before="200" w:after="80"/>
+      </w:pPr>
+      <w:r>
+        <w:rPr>
+          <w:b/>
+          <w:color w:val="0F2E4C"/>
+          <w:sz w:val="24"/>
+        </w:rPr>
+        <w:t>9.3 Conversies &amp; meetbaarheid</w:t>
+      </w:r>
+    </w:p>
+    <w:p>
+      <w:pPr>
+        <w:pStyle w:val="ListBullet"/>
+        <w:spacing w:after="40"/>
+        <w:ind w:left="340"/>
+      </w:pPr>
+      <w:r>
+        <w:rPr>
+          <w:b/>
+          <w:i w:val="0"/>
+          <w:color w:val="1F1F1F"/>
+          <w:sz w:val="22"/>
+        </w:rPr>
+        <w:t>Server-side GA4 + GTM-server</w:t>
+      </w:r>
+      <w:r>
+        <w:rPr>
+          <w:b w:val="0"/>
+          <w:i w:val="0"/>
+          <w:color w:val="1F1F1F"/>
+          <w:sz w:val="22"/>
+        </w:rPr>
+        <w:t xml:space="preserve"> om iOS/ITP-issues te omzeilen.</w:t>
+      </w:r>
+    </w:p>
+    <w:p>
+      <w:pPr>
+        <w:pStyle w:val="ListBullet"/>
+        <w:spacing w:after="40"/>
+        <w:ind w:left="340"/>
+      </w:pPr>
+      <w:r>
+        <w:rPr>
+          <w:b/>
+          <w:i w:val="0"/>
+          <w:color w:val="1F1F1F"/>
+          <w:sz w:val="22"/>
+        </w:rPr>
+        <w:t>Conversion-events per vertical:</w:t>
+      </w:r>
+      <w:r>
+        <w:rPr>
+          <w:b w:val="0"/>
+          <w:i w:val="0"/>
+          <w:color w:val="1F1F1F"/>
+          <w:sz w:val="22"/>
+        </w:rPr>
+        <w:t xml:space="preserve"> demo-aanvraag, datasheet-download, contact-formulier, telefoon-klik, webinar-aanmelding. Per event een waarde (demo ~€500, datasheet-download ~€20).</w:t>
+      </w:r>
+    </w:p>
+    <w:p>
+      <w:pPr>
+        <w:pStyle w:val="ListBullet"/>
+        <w:spacing w:after="40"/>
+        <w:ind w:left="340"/>
+      </w:pPr>
+      <w:r>
+        <w:rPr>
+          <w:b/>
+          <w:i w:val="0"/>
+          <w:color w:val="1F1F1F"/>
+          <w:sz w:val="22"/>
+        </w:rPr>
+        <w:t>Cross-domein tracking</w:t>
+      </w:r>
+      <w:r>
+        <w:rPr>
+          <w:b w:val="0"/>
+          <w:i w:val="0"/>
+          <w:color w:val="1F1F1F"/>
+          <w:sz w:val="22"/>
+        </w:rPr>
+        <w:t xml:space="preserve"> tussen gotopeo.com (corporate) en de drie verticals: één GA4-property per vertical, plus één rollup-property.</w:t>
+      </w:r>
+    </w:p>
+    <w:p>
+      <w:pPr>
+        <w:pStyle w:val="ListBullet"/>
+        <w:spacing w:after="40"/>
+        <w:ind w:left="340"/>
+      </w:pPr>
+      <w:r>
+        <w:rPr>
+          <w:b/>
+          <w:i w:val="0"/>
+          <w:color w:val="1F1F1F"/>
+          <w:sz w:val="22"/>
+        </w:rPr>
+        <w:t>CRM-integratie</w:t>
+      </w:r>
+      <w:r>
+        <w:rPr>
+          <w:b w:val="0"/>
+          <w:i w:val="0"/>
+          <w:color w:val="1F1F1F"/>
+          <w:sz w:val="22"/>
+        </w:rPr>
+        <w:t xml:space="preserve"> (HubSpot/Salesforce). Closed-loop attribution. Voor B2B met lange cycli (medical = 6-18 maanden) is dit het verschil tussen “wat we denken dat werkt” en “wat echt werkt”.</w:t>
+      </w:r>
+    </w:p>
+    <w:p>
+      <w:pPr>
+        <w:spacing w:before="200" w:after="80"/>
+      </w:pPr>
+      <w:r>
+        <w:rPr>
+          <w:b/>
+          <w:color w:val="0F2E4C"/>
+          <w:sz w:val="24"/>
+        </w:rPr>
+        <w:t>9.4 Budgetverdeling indicatief (eerste 12 maanden)</w:t>
+      </w:r>
+    </w:p>
+    <w:p>
+      <w:pPr>
+        <w:pStyle w:val="ListBullet"/>
+        <w:spacing w:after="40"/>
+        <w:ind w:left="340"/>
+      </w:pPr>
+      <w:r>
+        <w:rPr>
+          <w:b/>
+          <w:i w:val="0"/>
+          <w:color w:val="1F1F1F"/>
+          <w:sz w:val="22"/>
+        </w:rPr>
+        <w:t xml:space="preserve">40-45% </w:t>
+      </w:r>
+      <w:r>
+        <w:rPr>
+          <w:b w:val="0"/>
+          <w:i w:val="0"/>
+          <w:color w:val="1F1F1F"/>
+          <w:sz w:val="22"/>
+        </w:rPr>
+        <w:t>Google Search (verdeeld over 3 verticals naar rato van marktomvang).</w:t>
+      </w:r>
+    </w:p>
+    <w:p>
+      <w:pPr>
+        <w:pStyle w:val="ListBullet"/>
+        <w:spacing w:after="40"/>
+        <w:ind w:left="340"/>
+      </w:pPr>
+      <w:r>
+        <w:rPr>
+          <w:b/>
+          <w:i w:val="0"/>
+          <w:color w:val="1F1F1F"/>
+          <w:sz w:val="22"/>
+        </w:rPr>
+        <w:t xml:space="preserve">25-30% </w:t>
+      </w:r>
+      <w:r>
+        <w:rPr>
+          <w:b w:val="0"/>
+          <w:i w:val="0"/>
+          <w:color w:val="1F1F1F"/>
+          <w:sz w:val="22"/>
+        </w:rPr>
+        <w:t>LinkedIn (vooral Medical en Photonics).</w:t>
+      </w:r>
+    </w:p>
+    <w:p>
+      <w:pPr>
+        <w:pStyle w:val="ListBullet"/>
+        <w:spacing w:after="40"/>
+        <w:ind w:left="340"/>
+      </w:pPr>
+      <w:r>
+        <w:rPr>
+          <w:b/>
+          <w:i w:val="0"/>
+          <w:color w:val="1F1F1F"/>
+          <w:sz w:val="22"/>
+        </w:rPr>
+        <w:t xml:space="preserve">10% </w:t>
+      </w:r>
+      <w:r>
+        <w:rPr>
+          <w:b w:val="0"/>
+          <w:i w:val="0"/>
+          <w:color w:val="1F1F1F"/>
+          <w:sz w:val="22"/>
+        </w:rPr>
+        <w:t>Retargeting (Display + LinkedIn).</w:t>
+      </w:r>
+    </w:p>
+    <w:p>
+      <w:pPr>
+        <w:pStyle w:val="ListBullet"/>
+        <w:spacing w:after="40"/>
+        <w:ind w:left="340"/>
+      </w:pPr>
+      <w:r>
+        <w:rPr>
+          <w:b/>
+          <w:i w:val="0"/>
+          <w:color w:val="1F1F1F"/>
+          <w:sz w:val="22"/>
+        </w:rPr>
+        <w:t xml:space="preserve">10% </w:t>
+      </w:r>
+      <w:r>
+        <w:rPr>
+          <w:b w:val="0"/>
+          <w:i w:val="0"/>
+          <w:color w:val="1F1F1F"/>
+          <w:sz w:val="22"/>
+        </w:rPr>
+        <w:t>Trade-media-sponsoring (per vertical 1 vakblad).</w:t>
+      </w:r>
+    </w:p>
+    <w:p>
+      <w:pPr>
+        <w:pStyle w:val="ListBullet"/>
+        <w:spacing w:after="40"/>
+        <w:ind w:left="340"/>
+      </w:pPr>
+      <w:r>
+        <w:rPr>
+          <w:b/>
+          <w:i w:val="0"/>
+          <w:color w:val="1F1F1F"/>
+          <w:sz w:val="22"/>
+        </w:rPr>
+        <w:t xml:space="preserve">5-10% </w:t>
+      </w:r>
+      <w:r>
+        <w:rPr>
+          <w:b w:val="0"/>
+          <w:i w:val="0"/>
+          <w:color w:val="1F1F1F"/>
+          <w:sz w:val="22"/>
+        </w:rPr>
+        <w:t>Experiment-budget (YouTube pre-roll, Reddit voor Photonics-engineers, etc.).</w:t>
+      </w:r>
+    </w:p>
+    <w:p>
+      <w:pPr>
+        <w:spacing w:after="120"/>
+      </w:pPr>
+      <w:r>
+        <w:rPr>
+          <w:b w:val="0"/>
+          <w:i w:val="0"/>
+          <w:color w:val="1F1F1F"/>
+          <w:sz w:val="22"/>
+        </w:rPr>
+        <w:t xml:space="preserve">Reserveer minimaal </w:t>
+      </w:r>
+      <w:r>
+        <w:rPr>
+          <w:b/>
+          <w:i w:val="0"/>
+          <w:color w:val="1F1F1F"/>
+          <w:sz w:val="22"/>
+        </w:rPr>
+        <w:t>15% test-budget per kwartaal</w:t>
+      </w:r>
+      <w:r>
+        <w:rPr>
+          <w:b w:val="0"/>
+          <w:i w:val="0"/>
+          <w:color w:val="1F1F1F"/>
+          <w:sz w:val="22"/>
+        </w:rPr>
+        <w:t xml:space="preserve"> — anders fossiliseert de mix.</w:t>
+      </w:r>
+    </w:p>
+    <w:p>
+      <w:pPr>
+        <w:spacing w:before="200" w:after="80"/>
+      </w:pPr>
+      <w:r>
+        <w:rPr>
+          <w:b/>
+          <w:color w:val="0F2E4C"/>
+          <w:sz w:val="24"/>
+        </w:rPr>
+        <w:t>9.5 Eerste 90 dagen — concrete to-do</w:t>
+      </w:r>
+    </w:p>
+    <w:p>
+      <w:pPr>
+        <w:pStyle w:val="ListBullet"/>
+        <w:spacing w:after="40"/>
+        <w:ind w:left="340"/>
+      </w:pPr>
+      <w:r>
+        <w:rPr>
+          <w:b/>
+          <w:i w:val="0"/>
+          <w:color w:val="1F1F1F"/>
+          <w:sz w:val="22"/>
+        </w:rPr>
+        <w:t xml:space="preserve">Week 1-2: </w:t>
+      </w:r>
+      <w:r>
+        <w:rPr>
+          <w:b w:val="0"/>
+          <w:i w:val="0"/>
+          <w:color w:val="1F1F1F"/>
+          <w:sz w:val="22"/>
+        </w:rPr>
+        <w:t>tracking schoon (GA4 + GTM + CRM-koppeling), conversie-events definiëren.</w:t>
+      </w:r>
+    </w:p>
+    <w:p>
+      <w:pPr>
+        <w:pStyle w:val="ListBullet"/>
+        <w:spacing w:after="40"/>
+        <w:ind w:left="340"/>
+      </w:pPr>
+      <w:r>
+        <w:rPr>
+          <w:b/>
+          <w:i w:val="0"/>
+          <w:color w:val="1F1F1F"/>
+          <w:sz w:val="22"/>
+        </w:rPr>
+        <w:t xml:space="preserve">Week 3-4: </w:t>
+      </w:r>
+      <w:r>
+        <w:rPr>
+          <w:b w:val="0"/>
+          <w:i w:val="0"/>
+          <w:color w:val="1F1F1F"/>
+          <w:sz w:val="22"/>
+        </w:rPr>
+        <w:t>3 sets van ~15 long-tail keyword-clusters bouwen (1 per vertical). LinkedIn-doelgroepen + matched audiences uploaden.</w:t>
+      </w:r>
+    </w:p>
+    <w:p>
+      <w:pPr>
+        <w:pStyle w:val="ListBullet"/>
+        <w:spacing w:after="40"/>
+        <w:ind w:left="340"/>
+      </w:pPr>
+      <w:r>
+        <w:rPr>
+          <w:b/>
+          <w:i w:val="0"/>
+          <w:color w:val="1F1F1F"/>
+          <w:sz w:val="22"/>
+        </w:rPr>
+        <w:t xml:space="preserve">Week 5-8: </w:t>
+      </w:r>
+      <w:r>
+        <w:rPr>
+          <w:b w:val="0"/>
+          <w:i w:val="0"/>
+          <w:color w:val="1F1F1F"/>
+          <w:sz w:val="22"/>
+        </w:rPr>
+        <w:t>3 pillar-pagina's live (1 per vertical) — zonder die heeft paid weinig zin.</w:t>
+      </w:r>
+    </w:p>
+    <w:p>
+      <w:pPr>
+        <w:pStyle w:val="ListBullet"/>
+        <w:spacing w:after="40"/>
+        <w:ind w:left="340"/>
+      </w:pPr>
+      <w:r>
+        <w:rPr>
+          <w:b/>
+          <w:i w:val="0"/>
+          <w:color w:val="1F1F1F"/>
+          <w:sz w:val="22"/>
+        </w:rPr>
+        <w:t xml:space="preserve">Week 9-12: </w:t>
+      </w:r>
+      <w:r>
+        <w:rPr>
+          <w:b w:val="0"/>
+          <w:i w:val="0"/>
+          <w:color w:val="1F1F1F"/>
+          <w:sz w:val="22"/>
+        </w:rPr>
+        <w:t>campagnes live, ~€10k/maand verspreid over de mix, wekelijkse optimalisatie. Eerste “wat werkt”-rapportage na 8 weken.</w:t>
+      </w:r>
+    </w:p>
+    <w:p>
+      <w:pPr>
+        <w:spacing w:before="200" w:after="80"/>
+      </w:pPr>
+      <w:r>
+        <w:rPr>
+          <w:b/>
+          <w:color w:val="0F2E4C"/>
+          <w:sz w:val="24"/>
+        </w:rPr>
+        <w:t>9.6 Volgorde t.o.v. SEO-cleanup</w:t>
+      </w:r>
+    </w:p>
+    <w:p>
+      <w:pPr>
+        <w:spacing w:after="120"/>
+      </w:pPr>
+      <w:r>
+        <w:rPr>
+          <w:color w:val="1F1F1F"/>
+          <w:sz w:val="22"/>
+        </w:rPr>
+        <w:t>Niet alles sequentieel — drie sporen parallel beleggen zodra de migratie gepland is.</w:t>
+      </w:r>
+    </w:p>
+    <w:p>
+      <w:pPr>
+        <w:spacing w:after="120"/>
+      </w:pPr>
+      <w:r>
+        <w:rPr>
+          <w:b/>
+          <w:i w:val="0"/>
+          <w:color w:val="1F1F1F"/>
+          <w:sz w:val="22"/>
+        </w:rPr>
+        <w:t>Wachten tot SEO-fundament écht klaar is:</w:t>
+      </w:r>
+    </w:p>
+    <w:p>
+      <w:pPr>
+        <w:pStyle w:val="ListBullet"/>
+        <w:spacing w:after="40"/>
+        <w:ind w:left="340"/>
+      </w:pPr>
+      <w:r>
+        <w:rPr>
+          <w:color w:val="1F1F1F"/>
+          <w:sz w:val="22"/>
+        </w:rPr>
+        <w:t>Pillar-pagina's bouwen op de nieuwe canonical URL-structuur (anders 301'en).</w:t>
+      </w:r>
+    </w:p>
+    <w:p>
+      <w:pPr>
+        <w:pStyle w:val="ListBullet"/>
+        <w:spacing w:after="40"/>
+        <w:ind w:left="340"/>
+      </w:pPr>
+      <w:r>
+        <w:rPr>
+          <w:color w:val="1F1F1F"/>
+          <w:sz w:val="22"/>
+        </w:rPr>
+        <w:t>Backlink-/PR-campagnes voor pillars (links via 301 = ~5-15% equity-verlies).</w:t>
+      </w:r>
+    </w:p>
+    <w:p>
+      <w:pPr>
+        <w:pStyle w:val="ListBullet"/>
+        <w:spacing w:after="40"/>
+        <w:ind w:left="340"/>
+      </w:pPr>
+      <w:r>
+        <w:rPr>
+          <w:color w:val="1F1F1F"/>
+          <w:sz w:val="22"/>
+        </w:rPr>
+        <w:t>Grote Google Search-campagnes naar landingspagina's die straks veranderen.</w:t>
+      </w:r>
+    </w:p>
+    <w:p>
+      <w:pPr>
+        <w:spacing w:after="120"/>
+      </w:pPr>
+      <w:r>
+        <w:rPr>
+          <w:b/>
+          <w:i w:val="0"/>
+          <w:color w:val="1F1F1F"/>
+          <w:sz w:val="22"/>
+        </w:rPr>
+        <w:t>Wel parallel mogelijk:</w:t>
+      </w:r>
+    </w:p>
+    <w:p>
+      <w:pPr>
+        <w:pStyle w:val="ListBullet"/>
+        <w:spacing w:after="40"/>
+        <w:ind w:left="340"/>
+      </w:pPr>
+      <w:r>
+        <w:rPr>
+          <w:color w:val="1F1F1F"/>
+          <w:sz w:val="22"/>
+        </w:rPr>
+        <w:t>Tracking &amp; meetbaarheid op orde (sterker: nodig om migratie-impact te meten).</w:t>
+      </w:r>
+    </w:p>
+    <w:p>
+      <w:pPr>
+        <w:pStyle w:val="ListBullet"/>
+        <w:spacing w:after="40"/>
+        <w:ind w:left="340"/>
+      </w:pPr>
+      <w:r>
+        <w:rPr>
+          <w:color w:val="1F1F1F"/>
+          <w:sz w:val="22"/>
+        </w:rPr>
+        <w:t>LinkedIn ABM-campagnes (verwijzen meestal naar één gated landingspagina, los van site-structuur).</w:t>
+      </w:r>
+    </w:p>
+    <w:p>
+      <w:pPr>
+        <w:pStyle w:val="ListBullet"/>
+        <w:spacing w:after="40"/>
+        <w:ind w:left="340"/>
+      </w:pPr>
+      <w:r>
+        <w:rPr>
+          <w:color w:val="1F1F1F"/>
+          <w:sz w:val="22"/>
+        </w:rPr>
+        <w:t>Brand-defence search-campagnes (klein, on-brand, geen ranking-risico).</w:t>
+      </w:r>
+    </w:p>
+    <w:p>
+      <w:pPr>
+        <w:pStyle w:val="ListBullet"/>
+        <w:spacing w:after="40"/>
+        <w:ind w:left="340"/>
+      </w:pPr>
+      <w:r>
+        <w:rPr>
+          <w:color w:val="1F1F1F"/>
+          <w:sz w:val="22"/>
+        </w:rPr>
+        <w:t>Content plannen en de eerste pillar al schrijven mits op de definitieve URL.</w:t>
+      </w:r>
+    </w:p>
+    <w:p>
+      <w:pPr>
+        <w:spacing w:after="120"/>
+      </w:pPr>
+      <w:r>
+        <w:rPr>
+          <w:b/>
+          <w:i w:val="0"/>
+          <w:color w:val="1F1F1F"/>
+          <w:sz w:val="22"/>
+        </w:rPr>
+        <w:t xml:space="preserve">Praktisch: </w:t>
+      </w:r>
+      <w:r>
+        <w:rPr>
+          <w:b w:val="0"/>
+          <w:i w:val="0"/>
+          <w:color w:val="1F1F1F"/>
+          <w:sz w:val="22"/>
+        </w:rPr>
+        <w:t>SEO-fixes + tracking + één pillar per vertical = ~8 weken parallel. Daarna zwaardere paid-campagnes opentrekken. Helemaal wachten tot alle 301's zijn afgerond is overdreven — maar paid op een nog vervuilde site is zonde van het geld.</w:t>
+      </w:r>
+    </w:p>
+    <w:p>
+      <w:pPr>
+        <w:spacing w:before="320" w:after="120"/>
+        <w:pBdr>
+          <w:bottom w:val="single" w:sz="6" w:space="1" w:color="F0801F"/>
+        </w:pBdr>
+      </w:pPr>
+      <w:r>
+        <w:rPr>
+          <w:b/>
+          <w:color w:val="0F2E4C"/>
+          <w:sz w:val="30"/>
+        </w:rPr>
         <w:t>Bronnen</w:t>
       </w:r>
     </w:p>

</xml_diff>